<commit_message>
fix: tighten lifecycle and DCT event causality
</commit_message>
<xml_diff>
--- a/VehicleSoundSynthV2_完整使用手册.docx
+++ b/VehicleSoundSynthV2_完整使用手册.docx
@@ -174,6 +174,66 @@
                 <w:color w:val="0B2545"/>
               </w:rPr>
               <w:t>V2 位于 VehicleSoundSynth-V2 文件夹，入口是 VehicleSoundSynth-V2.maxproj。不要用 V1 的 VehicleSoundSynth.maxproj 打开 V2；V1 文件夹应保持原样。</w:t>
+            </w:r>
+          </w:p>
+        </w:tc>
+      </w:tr>
+    </w:tbl>
+    <w:p>
+      <w:pPr>
+        <w:spacing w:after="0"/>
+      </w:pPr>
+    </w:p>
+    <w:tbl>
+      <w:tblPr>
+        <w:tblW w:type="dxa" w:w="9360"/>
+        <w:jc w:val="left"/>
+        <w:tblLayout w:type="fixed"/>
+        <w:tblLook w:firstColumn="1" w:firstRow="1" w:lastColumn="0" w:lastRow="0" w:noHBand="0" w:noVBand="1" w:val="04A0"/>
+        <w:tblInd w:w="120" w:type="dxa"/>
+        <w:tblBorders>
+          <w:top w:val="single" w:sz="6" w:space="0" w:color="C8D1DC"/>
+          <w:left w:val="single" w:sz="6" w:space="0" w:color="C8D1DC"/>
+          <w:bottom w:val="single" w:sz="6" w:space="0" w:color="C8D1DC"/>
+          <w:right w:val="single" w:sz="6" w:space="0" w:color="C8D1DC"/>
+          <w:insideH w:val="single" w:sz="6" w:space="0" w:color="C8D1DC"/>
+          <w:insideV w:val="single" w:sz="6" w:space="0" w:color="C8D1DC"/>
+        </w:tblBorders>
+      </w:tblPr>
+      <w:tblGrid>
+        <w:gridCol w:w="9360"/>
+      </w:tblGrid>
+      <w:tr>
+        <w:tc>
+          <w:tcPr>
+            <w:tcW w:type="dxa" w:w="9360"/>
+            <w:vAlign w:val="center"/>
+            <w:tcMar>
+              <w:top w:w="80" w:type="dxa"/>
+              <w:bottom w:w="80" w:type="dxa"/>
+              <w:start w:w="120" w:type="dxa"/>
+              <w:end w:w="120" w:type="dxa"/>
+            </w:tcMar>
+            <w:shd w:fill="F4F6F9"/>
+          </w:tcPr>
+          <w:p>
+            <w:pPr>
+              <w:spacing w:after="0"/>
+            </w:pPr>
+            <w:r>
+              <w:rPr>
+                <w:rFonts w:ascii="Calibri" w:hAnsi="Calibri" w:eastAsia="PingFang SC"/>
+                <w:b/>
+                <w:color w:val="1F4D78"/>
+              </w:rPr>
+              <w:t xml:space="preserve">拟真边界  </w:t>
+            </w:r>
+            <w:r>
+              <w:rPr>
+                <w:rFonts w:ascii="Calibri" w:hAnsi="Calibri" w:eastAsia="PingFang SC"/>
+                <w:color w:val="0B2545"/>
+              </w:rPr>
+              <w:t>V12/V10 根据四冲程点火阶次、负载包络和共振谐波构建，是可调的程序化声学 archetype，并非对某一量产车型录音的测量匹配复刻。用于正式车型前仍应与参考录音做盲听和频谱校准。</w:t>
             </w:r>
           </w:p>
         </w:tc>

</xml_diff>